<commit_message>
updated table top games
</commit_message>
<xml_diff>
--- a/SpelRegelsFinal.docx
+++ b/SpelRegelsFinal.docx
@@ -712,7 +712,33 @@
         <w:rPr>
           <w:lang w:val="nl-BE"/>
         </w:rPr>
-        <w:t>(beeldkaart = hoogste)</w:t>
+        <w:t>(beeldkaart</w:t>
+      </w:r>
+      <w:r>
+        <w:rPr>
+          <w:lang w:val="nl-BE"/>
+        </w:rPr>
+        <w:t xml:space="preserve"> mag je </w:t>
+      </w:r>
+      <w:r>
+        <w:rPr>
+          <w:b/>
+          <w:bCs/>
+          <w:lang w:val="nl-BE"/>
+        </w:rPr>
+        <w:t>NIET</w:t>
+      </w:r>
+      <w:r>
+        <w:rPr>
+          <w:lang w:val="nl-BE"/>
+        </w:rPr>
+        <w:t xml:space="preserve"> gebruiken, heb je alleen beeldkaarten? Dan gaat het duel niet door en pak je 1 extra kaart</w:t>
+      </w:r>
+      <w:r>
+        <w:rPr>
+          <w:lang w:val="nl-BE"/>
+        </w:rPr>
+        <w:t>)</w:t>
       </w:r>
     </w:p>
     <w:p>

</xml_diff>